<commit_message>
fix(facture): renommer devis → facture dans email et template docx
Email (devis.service.ts) :
- Sujet FR/EN : 'devis/quote' → 'facture/invoice'
- Titre HTML : DEVIS/QUOTE → FACTURE/INVOICE
- Section : 'Détails de la commande' → 'Détails de la facture'
- Section EN : 'Order Details' → 'Invoice Details'
- Conditions : 'Ce devis est valable' → 'Cette facture est valable'
- Conditions EN : 'This quote is valid' → 'This invoice is valid'
- Coordonnées bancaires mises à jour (Banque : NSIA, Titulaire : NSC, IBAN réel)
- Ajout N° Compte : 069108202002 entre IBAN et BIC/SWIFT (FR et EN)

Template DOCX (devis-template.docx) :
- 'Ref. devis :' → 'Ref. facture :'
- Ajout ligne N° Compte : 069108202002 entre IBAN et BIC/SWIFT

Co-Authored-By: Claude Sonnet 4.6 <noreply@anthropic.com>
</commit_message>
<xml_diff>
--- a/forges-monorepo/backend/templates/devis-template.docx
+++ b/forges-monorepo/backend/templates/devis-template.docx
@@ -806,7 +806,7 @@
                 <w:sz w:val="16"/>
                 <w:szCs w:val="16"/>
               </w:rPr>
-              <w:t xml:space="preserve">Ref. devis : {ref_devis}</w:t>
+              <w:t xml:space="preserve">Ref. facture : {ref_devis}</w:t>
             </w:r>
           </w:p>
         </w:tc>
@@ -1908,6 +1908,71 @@
                     <w:t xml:space="preserve">IBAN : CI93 CI04 2012 9106 9108 2020 0294</w:t>
                   </w:r>
                 </w:p>
+              </w:tc>
+            </w:tr>
+            <w:tr>
+              <w:tc>
+                <w:tcPr>
+                  <w:tcW w:type="dxa" w:w="4413"/>
+                  <w:tcBorders>
+                    <w:top w:val="single" w:color="CCCCCC" w:sz="4"/>
+                    <w:left w:val="single" w:color="CCCCCC" w:sz="4"/>
+                    <w:bottom w:val="single" w:color="CCCCCC" w:sz="4"/>
+                    <w:right w:val="single" w:color="CCCCCC" w:sz="4"/>
+                  </w:tcBorders>
+                  <w:shd w:fill="F5F7FA" w:val="clear"/>
+                  <w:tcMar>
+                    <w:top w:type="dxa" w:w="70"/>
+                    <w:left w:type="dxa" w:w="100"/>
+                    <w:bottom w:type="dxa" w:w="70"/>
+                    <w:right w:type="dxa" w:w="100"/>
+                  </w:tcMar>
+                </w:tcPr>
+                <w:p>
+                  <w:r>
+                    <w:rPr>
+                      <w:rFonts w:ascii="Courier New" w:cs="Courier New" w:eastAsia="Courier New" w:hAnsi="Courier New"/>
+                      <w:b w:val="false"/>
+                      <w:bCs w:val="false"/>
+                      <w:color w:val="1A3A6B"/>
+                      <w:sz w:val="16"/>
+                      <w:szCs w:val="16"/>
+                    </w:rPr>
+                    <w:t xml:space="preserve">N° Compte : 069108202002</w:t>
+                  </w:r>
+                </w:p>
+              </w:tc>
+              <w:tc>
+                <w:tcPr>
+                  <w:tcW w:type="dxa" w:w="200"/>
+                  <w:tcBorders>
+                    <w:top w:val="none"/>
+                    <w:left w:val="none"/>
+                    <w:bottom w:val="none"/>
+                    <w:right w:val="none"/>
+                  </w:tcBorders>
+                  <w:shd w:fill="FFFFFF" w:val="clear"/>
+                </w:tcPr>
+                <w:p/>
+              </w:tc>
+              <w:tc>
+                <w:tcPr>
+                  <w:tcW w:type="dxa" w:w="4413"/>
+                  <w:tcBorders>
+                    <w:top w:val="single" w:color="CCCCCC" w:sz="4"/>
+                    <w:left w:val="single" w:color="CCCCCC" w:sz="4"/>
+                    <w:bottom w:val="single" w:color="CCCCCC" w:sz="4"/>
+                    <w:right w:val="single" w:color="CCCCCC" w:sz="4"/>
+                  </w:tcBorders>
+                  <w:shd w:fill="FFFFFF" w:val="clear"/>
+                  <w:tcMar>
+                    <w:top w:type="dxa" w:w="70"/>
+                    <w:left w:type="dxa" w:w="100"/>
+                    <w:bottom w:type="dxa" w:w="70"/>
+                    <w:right w:type="dxa" w:w="100"/>
+                  </w:tcMar>
+                </w:tcPr>
+                <w:p/>
               </w:tc>
             </w:tr>
             <w:tr>

</xml_diff>

<commit_message>
fix(devis): renommer devis → facture, ajouter N° Compte dans template DOCX
- devis-template.docx : ajout ligne N° Compte 069108202002 entre IBAN et BIC/SWIFT
  avec gridSpan=3 (pleine largeur), fond FFFFFF, sans cellule vide à droite
- envoyer-devis-anssi.ts : sujet/badge/corps → FACTURE, pièce jointe DOCX
  via genererDocxDevis, destinataire par défaut TidianeCisse9@outlook.fr

Co-Authored-By: Claude Sonnet 4.6 <noreply@anthropic.com>
</commit_message>
<xml_diff>
--- a/forges-monorepo/backend/templates/devis-template.docx
+++ b/forges-monorepo/backend/templates/devis-template.docx
@@ -1913,14 +1913,15 @@
             <w:tr>
               <w:tc>
                 <w:tcPr>
-                  <w:tcW w:type="dxa" w:w="4413"/>
+                  <w:tcW w:type="dxa" w:w="9026"/>
+                  <w:gridSpan w:val="3"/>
                   <w:tcBorders>
                     <w:top w:val="single" w:color="CCCCCC" w:sz="4"/>
                     <w:left w:val="single" w:color="CCCCCC" w:sz="4"/>
                     <w:bottom w:val="single" w:color="CCCCCC" w:sz="4"/>
                     <w:right w:val="single" w:color="CCCCCC" w:sz="4"/>
                   </w:tcBorders>
-                  <w:shd w:fill="F5F7FA" w:val="clear"/>
+                  <w:shd w:fill="FFFFFF" w:val="clear"/>
                   <w:tcMar>
                     <w:top w:type="dxa" w:w="70"/>
                     <w:left w:type="dxa" w:w="100"/>
@@ -1941,38 +1942,6 @@
                     <w:t xml:space="preserve">N° Compte : 069108202002</w:t>
                   </w:r>
                 </w:p>
-              </w:tc>
-              <w:tc>
-                <w:tcPr>
-                  <w:tcW w:type="dxa" w:w="200"/>
-                  <w:tcBorders>
-                    <w:top w:val="none"/>
-                    <w:left w:val="none"/>
-                    <w:bottom w:val="none"/>
-                    <w:right w:val="none"/>
-                  </w:tcBorders>
-                  <w:shd w:fill="FFFFFF" w:val="clear"/>
-                </w:tcPr>
-                <w:p/>
-              </w:tc>
-              <w:tc>
-                <w:tcPr>
-                  <w:tcW w:type="dxa" w:w="4413"/>
-                  <w:tcBorders>
-                    <w:top w:val="single" w:color="CCCCCC" w:sz="4"/>
-                    <w:left w:val="single" w:color="CCCCCC" w:sz="4"/>
-                    <w:bottom w:val="single" w:color="CCCCCC" w:sz="4"/>
-                    <w:right w:val="single" w:color="CCCCCC" w:sz="4"/>
-                  </w:tcBorders>
-                  <w:shd w:fill="FFFFFF" w:val="clear"/>
-                  <w:tcMar>
-                    <w:top w:type="dxa" w:w="70"/>
-                    <w:left w:type="dxa" w:w="100"/>
-                    <w:bottom w:type="dxa" w:w="70"/>
-                    <w:right w:type="dxa" w:w="100"/>
-                  </w:tcMar>
-                </w:tcPr>
-                <w:p/>
               </w:tc>
             </w:tr>
             <w:tr>

</xml_diff>

<commit_message>
fix: simplify devis footer
</commit_message>
<xml_diff>
--- a/forges-monorepo/backend/templates/devis-template.docx
+++ b/forges-monorepo/backend/templates/devis-template.docx
@@ -244,7 +244,7 @@
                 <w:sz w:val="16"/>
                 <w:szCs w:val="16"/>
               </w:rPr>
-              <w:t xml:space="preserve">+225 05 04 08 43 8X</w:t>
+              <w:t xml:space="preserve">+225 05 04 08 43 84</w:t>
             </w:r>
           </w:p>
         </w:tc>
@@ -686,6 +686,19 @@
                 <w:szCs w:val="16"/>
               </w:rPr>
               <w:t xml:space="preserve">IBAN : CI93 CI04 2012 9106 9108 2020 0294</w:t>
+            </w:r>
+          </w:p>
+          <w:p>
+            <w:r>
+              <w:rPr>
+                <w:rFonts w:ascii="Courier New" w:cs="Courier New" w:eastAsia="Courier New" w:hAnsi="Courier New"/>
+                <w:b w:val="false"/>
+                <w:bCs w:val="false"/>
+                <w:color w:val="1A3A6B"/>
+                <w:sz w:val="16"/>
+                <w:szCs w:val="16"/>
+              </w:rPr>
+              <w:t xml:space="preserve">N° Compte : 069108202002</w:t>
             </w:r>
           </w:p>
         </w:tc>
@@ -1906,6 +1919,39 @@
                       <w:szCs w:val="16"/>
                     </w:rPr>
                     <w:t xml:space="preserve">IBAN : CI93 CI04 2012 9106 9108 2020 0294</w:t>
+                  </w:r>
+                </w:p>
+              </w:tc>
+            </w:tr>
+            <w:tr>
+              <w:tc>
+                <w:tcPr>
+                  <w:tcW w:type="dxa" w:w="4874"/>
+                  <w:tcBorders>
+                    <w:top w:val="single" w:color="BBCFE0" w:sz="4"/>
+                    <w:left w:val="single" w:color="BBCFE0" w:sz="4"/>
+                    <w:bottom w:val="single" w:color="BBCFE0" w:sz="4"/>
+                    <w:right w:val="single" w:color="BBCFE0" w:sz="4"/>
+                  </w:tcBorders>
+                  <w:shd w:fill="EBF5FB" w:val="clear"/>
+                  <w:tcMar>
+                    <w:top w:type="dxa" w:w="60"/>
+                    <w:left w:type="dxa" w:w="100"/>
+                    <w:bottom w:type="dxa" w:w="60"/>
+                    <w:right w:type="dxa" w:w="100"/>
+                  </w:tcMar>
+                </w:tcPr>
+                <w:p>
+                  <w:r>
+                    <w:rPr>
+                      <w:rFonts w:ascii="Courier New" w:cs="Courier New" w:eastAsia="Courier New" w:hAnsi="Courier New"/>
+                      <w:b w:val="false"/>
+                      <w:bCs w:val="false"/>
+                      <w:color w:val="1A3A6B"/>
+                      <w:sz w:val="16"/>
+                      <w:szCs w:val="16"/>
+                    </w:rPr>
+                    <w:t xml:space="preserve">N° Compte : 069108202002</w:t>
                   </w:r>
                 </w:p>
               </w:tc>
@@ -2487,7 +2533,7 @@
         <w:sz w:val="14"/>
         <w:szCs w:val="14"/>
       </w:rPr>
-      <w:t xml:space="preserve">Network Services Consulting - Enregistre en Cote d'Ivoire - contact@forges-group.com - www.forges-group.com</w:t>
+      <w:t xml:space="preserve">Network Services Consulting - Enregistre en Cote d'Ivoire - edu.forges-group.com</w:t>
     </w:r>
   </w:p>
 </w:ftr>

</xml_diff>

<commit_message>
fix: clean up monitoring and receipts
</commit_message>
<xml_diff>
--- a/forges-monorepo/backend/templates/devis-template.docx
+++ b/forges-monorepo/backend/templates/devis-template.docx
@@ -29,7 +29,7 @@
               <w:bottom w:val="none"/>
               <w:right w:val="none"/>
             </w:tcBorders>
-            <w:shd w:fill="0D1B3E" w:val="clear"/>
+            <w:shd w:fill="1B4F72" w:val="clear"/>
             <w:tcMar>
               <w:top w:type="dxa" w:w="60"/>
               <w:left w:type="dxa" w:w="80"/>
@@ -93,7 +93,7 @@
               <w:bottom w:val="none"/>
               <w:right w:val="none"/>
             </w:tcBorders>
-            <w:shd w:fill="0D1B3E" w:val="clear"/>
+            <w:shd w:fill="1B4F72" w:val="clear"/>
             <w:tcMar>
               <w:top w:type="dxa" w:w="40"/>
               <w:left w:type="dxa" w:w="100"/>
@@ -129,7 +129,7 @@
                 <w:rFonts w:ascii="Arial" w:cs="Arial" w:eastAsia="Arial" w:hAnsi="Arial"/>
                 <w:b/>
                 <w:bCs/>
-                <w:color w:val="C8A84B"/>
+                <w:color w:val="2E86C1"/>
                 <w:sz w:val="19"/>
                 <w:szCs w:val="19"/>
               </w:rPr>
@@ -161,7 +161,7 @@
               <w:bottom w:val="none"/>
               <w:right w:val="none"/>
             </w:tcBorders>
-            <w:shd w:fill="0D1B3E" w:val="clear"/>
+            <w:shd w:fill="1B4F72" w:val="clear"/>
             <w:tcMar>
               <w:top w:type="dxa" w:w="40"/>
               <w:left w:type="dxa" w:w="100"/>
@@ -180,7 +180,7 @@
                 <w:rFonts w:ascii="Arial" w:cs="Arial" w:eastAsia="Arial" w:hAnsi="Arial"/>
                 <w:b/>
                 <w:bCs/>
-                <w:color w:val="C8A84B"/>
+                <w:color w:val="2E86C1"/>
                 <w:sz w:val="18"/>
                 <w:szCs w:val="18"/>
               </w:rPr>
@@ -277,12 +277,12 @@
           <w:tcPr>
             <w:tcW w:type="dxa" w:w="4413"/>
             <w:tcBorders>
-              <w:top w:val="single" w:color="0D1B3E" w:sz="4"/>
-              <w:left w:val="single" w:color="0D1B3E" w:sz="4"/>
-              <w:bottom w:val="single" w:color="0D1B3E" w:sz="4"/>
-              <w:right w:val="single" w:color="0D1B3E" w:sz="4"/>
-            </w:tcBorders>
-            <w:shd w:fill="0D1B3E" w:val="clear"/>
+              <w:top w:val="single" w:color="1B4F72" w:sz="4"/>
+              <w:left w:val="single" w:color="1B4F72" w:sz="4"/>
+              <w:bottom w:val="single" w:color="1B4F72" w:sz="4"/>
+              <w:right w:val="single" w:color="1B4F72" w:sz="4"/>
+            </w:tcBorders>
+            <w:shd w:fill="1B4F72" w:val="clear"/>
             <w:tcMar>
               <w:top w:type="dxa" w:w="80"/>
               <w:left w:type="dxa" w:w="120"/>
@@ -321,12 +321,12 @@
           <w:tcPr>
             <w:tcW w:type="dxa" w:w="4413"/>
             <w:tcBorders>
-              <w:top w:val="single" w:color="0D1B3E" w:sz="4"/>
-              <w:left w:val="single" w:color="0D1B3E" w:sz="4"/>
-              <w:bottom w:val="single" w:color="0D1B3E" w:sz="4"/>
-              <w:right w:val="single" w:color="0D1B3E" w:sz="4"/>
-            </w:tcBorders>
-            <w:shd w:fill="0D1B3E" w:val="clear"/>
+              <w:top w:val="single" w:color="1B4F72" w:sz="4"/>
+              <w:left w:val="single" w:color="1B4F72" w:sz="4"/>
+              <w:bottom w:val="single" w:color="1B4F72" w:sz="4"/>
+              <w:right w:val="single" w:color="1B4F72" w:sz="4"/>
+            </w:tcBorders>
+            <w:shd w:fill="1B4F72" w:val="clear"/>
             <w:tcMar>
               <w:top w:type="dxa" w:w="80"/>
               <w:left w:type="dxa" w:w="120"/>
@@ -354,12 +354,12 @@
           <w:tcPr>
             <w:tcW w:type="dxa" w:w="4413"/>
             <w:tcBorders>
-              <w:top w:val="single" w:color="CCCCCC" w:sz="4"/>
-              <w:left w:val="single" w:color="CCCCCC" w:sz="4"/>
-              <w:bottom w:val="single" w:color="CCCCCC" w:sz="4"/>
-              <w:right w:val="single" w:color="CCCCCC" w:sz="4"/>
-            </w:tcBorders>
-            <w:shd w:fill="F5F7FA" w:val="clear"/>
+              <w:top w:val="single" w:color="D5D8DC" w:sz="4"/>
+              <w:left w:val="single" w:color="D5D8DC" w:sz="4"/>
+              <w:bottom w:val="single" w:color="D5D8DC" w:sz="4"/>
+              <w:right w:val="single" w:color="D5D8DC" w:sz="4"/>
+            </w:tcBorders>
+            <w:shd w:fill="F4F6F7" w:val="clear"/>
             <w:tcMar>
               <w:top w:type="dxa" w:w="70"/>
               <w:left w:type="dxa" w:w="100"/>
@@ -373,7 +373,7 @@
                 <w:rFonts w:ascii="Arial" w:cs="Arial" w:eastAsia="Arial" w:hAnsi="Arial"/>
                 <w:b/>
                 <w:bCs/>
-                <w:color w:val="1A3A6B"/>
+                <w:color w:val="1B4F72"/>
                 <w:sz w:val="18"/>
                 <w:szCs w:val="18"/>
               </w:rPr>
@@ -398,12 +398,12 @@
           <w:tcPr>
             <w:tcW w:type="dxa" w:w="4413"/>
             <w:tcBorders>
-              <w:top w:val="single" w:color="CCCCCC" w:sz="4"/>
-              <w:left w:val="single" w:color="CCCCCC" w:sz="4"/>
-              <w:bottom w:val="single" w:color="CCCCCC" w:sz="4"/>
-              <w:right w:val="single" w:color="CCCCCC" w:sz="4"/>
-            </w:tcBorders>
-            <w:shd w:fill="F5F7FA" w:val="clear"/>
+              <w:top w:val="single" w:color="D5D8DC" w:sz="4"/>
+              <w:left w:val="single" w:color="D5D8DC" w:sz="4"/>
+              <w:bottom w:val="single" w:color="D5D8DC" w:sz="4"/>
+              <w:right w:val="single" w:color="D5D8DC" w:sz="4"/>
+            </w:tcBorders>
+            <w:shd w:fill="F4F6F7" w:val="clear"/>
             <w:tcMar>
               <w:top w:type="dxa" w:w="70"/>
               <w:left w:type="dxa" w:w="100"/>
@@ -417,7 +417,7 @@
                 <w:rFonts w:ascii="Arial" w:cs="Arial" w:eastAsia="Arial" w:hAnsi="Arial"/>
                 <w:b/>
                 <w:bCs/>
-                <w:color w:val="1A1A2E"/>
+                <w:color w:val="1C2833"/>
                 <w:sz w:val="18"/>
                 <w:szCs w:val="18"/>
               </w:rPr>
@@ -431,10 +431,10 @@
           <w:tcPr>
             <w:tcW w:type="dxa" w:w="4413"/>
             <w:tcBorders>
-              <w:top w:val="single" w:color="CCCCCC" w:sz="4"/>
-              <w:left w:val="single" w:color="CCCCCC" w:sz="4"/>
-              <w:bottom w:val="single" w:color="CCCCCC" w:sz="4"/>
-              <w:right w:val="single" w:color="CCCCCC" w:sz="4"/>
+              <w:top w:val="single" w:color="D5D8DC" w:sz="4"/>
+              <w:left w:val="single" w:color="D5D8DC" w:sz="4"/>
+              <w:bottom w:val="single" w:color="D5D8DC" w:sz="4"/>
+              <w:right w:val="single" w:color="D5D8DC" w:sz="4"/>
             </w:tcBorders>
             <w:shd w:fill="FFFFFF" w:val="clear"/>
             <w:tcMar>
@@ -450,7 +450,7 @@
                 <w:rFonts w:ascii="Arial" w:cs="Arial" w:eastAsia="Arial" w:hAnsi="Arial"/>
                 <w:b w:val="false"/>
                 <w:bCs w:val="false"/>
-                <w:color w:val="1A1A2E"/>
+                <w:color w:val="1C2833"/>
                 <w:sz w:val="18"/>
                 <w:szCs w:val="18"/>
               </w:rPr>
@@ -475,10 +475,10 @@
           <w:tcPr>
             <w:tcW w:type="dxa" w:w="4413"/>
             <w:tcBorders>
-              <w:top w:val="single" w:color="CCCCCC" w:sz="4"/>
-              <w:left w:val="single" w:color="CCCCCC" w:sz="4"/>
-              <w:bottom w:val="single" w:color="CCCCCC" w:sz="4"/>
-              <w:right w:val="single" w:color="CCCCCC" w:sz="4"/>
+              <w:top w:val="single" w:color="D5D8DC" w:sz="4"/>
+              <w:left w:val="single" w:color="D5D8DC" w:sz="4"/>
+              <w:bottom w:val="single" w:color="D5D8DC" w:sz="4"/>
+              <w:right w:val="single" w:color="D5D8DC" w:sz="4"/>
             </w:tcBorders>
             <w:shd w:fill="FFFFFF" w:val="clear"/>
             <w:tcMar>
@@ -494,7 +494,7 @@
                 <w:rFonts w:ascii="Arial" w:cs="Arial" w:eastAsia="Arial" w:hAnsi="Arial"/>
                 <w:b w:val="false"/>
                 <w:bCs w:val="false"/>
-                <w:color w:val="1A1A2E"/>
+                <w:color w:val="1C2833"/>
                 <w:sz w:val="18"/>
                 <w:szCs w:val="18"/>
               </w:rPr>
@@ -508,12 +508,12 @@
           <w:tcPr>
             <w:tcW w:type="dxa" w:w="4413"/>
             <w:tcBorders>
-              <w:top w:val="single" w:color="CCCCCC" w:sz="4"/>
-              <w:left w:val="single" w:color="CCCCCC" w:sz="4"/>
-              <w:bottom w:val="single" w:color="CCCCCC" w:sz="4"/>
-              <w:right w:val="single" w:color="CCCCCC" w:sz="4"/>
-            </w:tcBorders>
-            <w:shd w:fill="F5F7FA" w:val="clear"/>
+              <w:top w:val="single" w:color="D5D8DC" w:sz="4"/>
+              <w:left w:val="single" w:color="D5D8DC" w:sz="4"/>
+              <w:bottom w:val="single" w:color="D5D8DC" w:sz="4"/>
+              <w:right w:val="single" w:color="D5D8DC" w:sz="4"/>
+            </w:tcBorders>
+            <w:shd w:fill="F4F6F7" w:val="clear"/>
             <w:tcMar>
               <w:top w:type="dxa" w:w="70"/>
               <w:left w:type="dxa" w:w="100"/>
@@ -527,7 +527,7 @@
                 <w:rFonts w:ascii="Arial" w:cs="Arial" w:eastAsia="Arial" w:hAnsi="Arial"/>
                 <w:b w:val="false"/>
                 <w:bCs w:val="false"/>
-                <w:color w:val="1A1A2E"/>
+                <w:color w:val="1C2833"/>
                 <w:sz w:val="18"/>
                 <w:szCs w:val="18"/>
               </w:rPr>
@@ -552,12 +552,12 @@
           <w:tcPr>
             <w:tcW w:type="dxa" w:w="4413"/>
             <w:tcBorders>
-              <w:top w:val="single" w:color="CCCCCC" w:sz="4"/>
-              <w:left w:val="single" w:color="CCCCCC" w:sz="4"/>
-              <w:bottom w:val="single" w:color="CCCCCC" w:sz="4"/>
-              <w:right w:val="single" w:color="CCCCCC" w:sz="4"/>
-            </w:tcBorders>
-            <w:shd w:fill="F5F7FA" w:val="clear"/>
+              <w:top w:val="single" w:color="D5D8DC" w:sz="4"/>
+              <w:left w:val="single" w:color="D5D8DC" w:sz="4"/>
+              <w:bottom w:val="single" w:color="D5D8DC" w:sz="4"/>
+              <w:right w:val="single" w:color="D5D8DC" w:sz="4"/>
+            </w:tcBorders>
+            <w:shd w:fill="F4F6F7" w:val="clear"/>
             <w:tcMar>
               <w:top w:type="dxa" w:w="70"/>
               <w:left w:type="dxa" w:w="100"/>
@@ -571,7 +571,7 @@
                 <w:rFonts w:ascii="Arial" w:cs="Arial" w:eastAsia="Arial" w:hAnsi="Arial"/>
                 <w:b w:val="false"/>
                 <w:bCs w:val="false"/>
-                <w:color w:val="1A1A2E"/>
+                <w:color w:val="1C2833"/>
                 <w:sz w:val="18"/>
                 <w:szCs w:val="18"/>
               </w:rPr>
@@ -585,10 +585,10 @@
           <w:tcPr>
             <w:tcW w:type="dxa" w:w="4413"/>
             <w:tcBorders>
-              <w:top w:val="single" w:color="CCCCCC" w:sz="4"/>
-              <w:left w:val="single" w:color="CCCCCC" w:sz="4"/>
-              <w:bottom w:val="single" w:color="CCCCCC" w:sz="4"/>
-              <w:right w:val="single" w:color="CCCCCC" w:sz="4"/>
+              <w:top w:val="single" w:color="D5D8DC" w:sz="4"/>
+              <w:left w:val="single" w:color="D5D8DC" w:sz="4"/>
+              <w:bottom w:val="single" w:color="D5D8DC" w:sz="4"/>
+              <w:right w:val="single" w:color="D5D8DC" w:sz="4"/>
             </w:tcBorders>
             <w:shd w:fill="FFFFFF" w:val="clear"/>
             <w:tcMar>
@@ -604,7 +604,7 @@
                 <w:rFonts w:ascii="Arial" w:cs="Arial" w:eastAsia="Arial" w:hAnsi="Arial"/>
                 <w:b w:val="false"/>
                 <w:bCs w:val="false"/>
-                <w:color w:val="1A1A2E"/>
+                <w:color w:val="1C2833"/>
                 <w:sz w:val="18"/>
                 <w:szCs w:val="18"/>
               </w:rPr>
@@ -629,10 +629,10 @@
           <w:tcPr>
             <w:tcW w:type="dxa" w:w="4413"/>
             <w:tcBorders>
-              <w:top w:val="single" w:color="CCCCCC" w:sz="4"/>
-              <w:left w:val="single" w:color="CCCCCC" w:sz="4"/>
-              <w:bottom w:val="single" w:color="CCCCCC" w:sz="4"/>
-              <w:right w:val="single" w:color="CCCCCC" w:sz="4"/>
+              <w:top w:val="single" w:color="D5D8DC" w:sz="4"/>
+              <w:left w:val="single" w:color="D5D8DC" w:sz="4"/>
+              <w:bottom w:val="single" w:color="D5D8DC" w:sz="4"/>
+              <w:right w:val="single" w:color="D5D8DC" w:sz="4"/>
             </w:tcBorders>
             <w:shd w:fill="FFFFFF" w:val="clear"/>
             <w:tcMar>
@@ -648,7 +648,7 @@
                 <w:rFonts w:ascii="Arial" w:cs="Arial" w:eastAsia="Arial" w:hAnsi="Arial"/>
                 <w:b w:val="false"/>
                 <w:bCs w:val="false"/>
-                <w:color w:val="1A1A2E"/>
+                <w:color w:val="1C2833"/>
                 <w:sz w:val="18"/>
                 <w:szCs w:val="18"/>
               </w:rPr>
@@ -662,12 +662,12 @@
           <w:tcPr>
             <w:tcW w:type="dxa" w:w="4413"/>
             <w:tcBorders>
-              <w:top w:val="single" w:color="CCCCCC" w:sz="4"/>
-              <w:left w:val="single" w:color="CCCCCC" w:sz="4"/>
-              <w:bottom w:val="single" w:color="CCCCCC" w:sz="4"/>
-              <w:right w:val="single" w:color="CCCCCC" w:sz="4"/>
-            </w:tcBorders>
-            <w:shd w:fill="F5F7FA" w:val="clear"/>
+              <w:top w:val="single" w:color="D5D8DC" w:sz="4"/>
+              <w:left w:val="single" w:color="D5D8DC" w:sz="4"/>
+              <w:bottom w:val="single" w:color="D5D8DC" w:sz="4"/>
+              <w:right w:val="single" w:color="D5D8DC" w:sz="4"/>
+            </w:tcBorders>
+            <w:shd w:fill="F4F6F7" w:val="clear"/>
             <w:tcMar>
               <w:top w:type="dxa" w:w="70"/>
               <w:left w:type="dxa" w:w="100"/>
@@ -681,7 +681,7 @@
                 <w:rFonts w:ascii="Courier New" w:cs="Courier New" w:eastAsia="Courier New" w:hAnsi="Courier New"/>
                 <w:b w:val="false"/>
                 <w:bCs w:val="false"/>
-                <w:color w:val="1A3A6B"/>
+                <w:color w:val="1B4F72"/>
                 <w:sz w:val="16"/>
                 <w:szCs w:val="16"/>
               </w:rPr>
@@ -694,7 +694,7 @@
                 <w:rFonts w:ascii="Courier New" w:cs="Courier New" w:eastAsia="Courier New" w:hAnsi="Courier New"/>
                 <w:b w:val="false"/>
                 <w:bCs w:val="false"/>
-                <w:color w:val="1A3A6B"/>
+                <w:color w:val="1B4F72"/>
                 <w:sz w:val="16"/>
                 <w:szCs w:val="16"/>
               </w:rPr>
@@ -719,12 +719,12 @@
           <w:tcPr>
             <w:tcW w:type="dxa" w:w="4413"/>
             <w:tcBorders>
-              <w:top w:val="single" w:color="CCCCCC" w:sz="4"/>
-              <w:left w:val="single" w:color="CCCCCC" w:sz="4"/>
-              <w:bottom w:val="single" w:color="CCCCCC" w:sz="4"/>
-              <w:right w:val="single" w:color="CCCCCC" w:sz="4"/>
-            </w:tcBorders>
-            <w:shd w:fill="F5F7FA" w:val="clear"/>
+              <w:top w:val="single" w:color="D5D8DC" w:sz="4"/>
+              <w:left w:val="single" w:color="D5D8DC" w:sz="4"/>
+              <w:bottom w:val="single" w:color="D5D8DC" w:sz="4"/>
+              <w:right w:val="single" w:color="D5D8DC" w:sz="4"/>
+            </w:tcBorders>
+            <w:shd w:fill="F4F6F7" w:val="clear"/>
             <w:tcMar>
               <w:top w:type="dxa" w:w="70"/>
               <w:left w:type="dxa" w:w="100"/>
@@ -738,7 +738,7 @@
                 <w:rFonts w:ascii="Arial" w:cs="Arial" w:eastAsia="Arial" w:hAnsi="Arial"/>
                 <w:b w:val="false"/>
                 <w:bCs w:val="false"/>
-                <w:color w:val="1A1A2E"/>
+                <w:color w:val="1C2833"/>
                 <w:sz w:val="18"/>
                 <w:szCs w:val="18"/>
               </w:rPr>
@@ -752,10 +752,10 @@
           <w:tcPr>
             <w:tcW w:type="dxa" w:w="4413"/>
             <w:tcBorders>
-              <w:top w:val="single" w:color="CCCCCC" w:sz="4"/>
-              <w:left w:val="single" w:color="CCCCCC" w:sz="4"/>
-              <w:bottom w:val="single" w:color="CCCCCC" w:sz="4"/>
-              <w:right w:val="single" w:color="CCCCCC" w:sz="4"/>
+              <w:top w:val="single" w:color="D5D8DC" w:sz="4"/>
+              <w:left w:val="single" w:color="D5D8DC" w:sz="4"/>
+              <w:bottom w:val="single" w:color="D5D8DC" w:sz="4"/>
+              <w:right w:val="single" w:color="D5D8DC" w:sz="4"/>
             </w:tcBorders>
             <w:shd w:fill="FFFFFF" w:val="clear"/>
             <w:tcMar>
@@ -771,7 +771,7 @@
                 <w:rFonts w:ascii="Courier New" w:cs="Courier New" w:eastAsia="Courier New" w:hAnsi="Courier New"/>
                 <w:b w:val="false"/>
                 <w:bCs w:val="false"/>
-                <w:color w:val="1A3A6B"/>
+                <w:color w:val="1B4F72"/>
                 <w:sz w:val="16"/>
                 <w:szCs w:val="16"/>
               </w:rPr>
@@ -796,10 +796,10 @@
           <w:tcPr>
             <w:tcW w:type="dxa" w:w="4413"/>
             <w:tcBorders>
-              <w:top w:val="single" w:color="CCCCCC" w:sz="4"/>
-              <w:left w:val="single" w:color="CCCCCC" w:sz="4"/>
-              <w:bottom w:val="single" w:color="CCCCCC" w:sz="4"/>
-              <w:right w:val="single" w:color="CCCCCC" w:sz="4"/>
+              <w:top w:val="single" w:color="D5D8DC" w:sz="4"/>
+              <w:left w:val="single" w:color="D5D8DC" w:sz="4"/>
+              <w:bottom w:val="single" w:color="D5D8DC" w:sz="4"/>
+              <w:right w:val="single" w:color="D5D8DC" w:sz="4"/>
             </w:tcBorders>
             <w:shd w:fill="FFFFFF" w:val="clear"/>
             <w:tcMar>
@@ -815,7 +815,7 @@
                 <w:rFonts w:ascii="Courier New" w:cs="Courier New" w:eastAsia="Courier New" w:hAnsi="Courier New"/>
                 <w:b w:val="false"/>
                 <w:bCs w:val="false"/>
-                <w:color w:val="1A3A6B"/>
+                <w:color w:val="1B4F72"/>
                 <w:sz w:val="16"/>
                 <w:szCs w:val="16"/>
               </w:rPr>
@@ -833,7 +833,7 @@
     <w:p>
       <w:pPr>
         <w:pBdr>
-          <w:bottom w:val="single" w:color="0D1B3E" w:sz="8" w:space="4"/>
+          <w:bottom w:val="single" w:color="1B4F72" w:sz="8" w:space="4"/>
         </w:pBdr>
         <w:spacing w:after="60" w:before="0"/>
       </w:pPr>
@@ -842,7 +842,7 @@
           <w:rFonts w:ascii="Arial" w:cs="Arial" w:eastAsia="Arial" w:hAnsi="Arial"/>
           <w:b/>
           <w:bCs/>
-          <w:color w:val="0D1B3E"/>
+          <w:color w:val="1B4F72"/>
           <w:sz w:val="18"/>
           <w:szCs w:val="18"/>
         </w:rPr>
@@ -878,12 +878,12 @@
           <w:tcPr>
             <w:tcW w:type="dxa" w:w="4000"/>
             <w:tcBorders>
-              <w:top w:val="single" w:color="0D1B3E" w:sz="4"/>
-              <w:left w:val="single" w:color="0D1B3E" w:sz="4"/>
-              <w:bottom w:val="single" w:color="0D1B3E" w:sz="4"/>
-              <w:right w:val="single" w:color="0D1B3E" w:sz="4"/>
-            </w:tcBorders>
-            <w:shd w:fill="0D1B3E" w:val="clear"/>
+              <w:top w:val="single" w:color="1B4F72" w:sz="4"/>
+              <w:left w:val="single" w:color="1B4F72" w:sz="4"/>
+              <w:bottom w:val="single" w:color="1B4F72" w:sz="4"/>
+              <w:right w:val="single" w:color="1B4F72" w:sz="4"/>
+            </w:tcBorders>
+            <w:shd w:fill="1B4F72" w:val="clear"/>
             <w:tcMar>
               <w:top w:type="dxa" w:w="80"/>
               <w:left w:type="dxa" w:w="120"/>
@@ -909,12 +909,12 @@
           <w:tcPr>
             <w:tcW w:type="dxa" w:w="1800"/>
             <w:tcBorders>
-              <w:top w:val="single" w:color="0D1B3E" w:sz="4"/>
-              <w:left w:val="single" w:color="0D1B3E" w:sz="4"/>
-              <w:bottom w:val="single" w:color="0D1B3E" w:sz="4"/>
-              <w:right w:val="single" w:color="0D1B3E" w:sz="4"/>
-            </w:tcBorders>
-            <w:shd w:fill="0D1B3E" w:val="clear"/>
+              <w:top w:val="single" w:color="1B4F72" w:sz="4"/>
+              <w:left w:val="single" w:color="1B4F72" w:sz="4"/>
+              <w:bottom w:val="single" w:color="1B4F72" w:sz="4"/>
+              <w:right w:val="single" w:color="1B4F72" w:sz="4"/>
+            </w:tcBorders>
+            <w:shd w:fill="1B4F72" w:val="clear"/>
             <w:tcMar>
               <w:top w:type="dxa" w:w="80"/>
               <w:left w:type="dxa" w:w="120"/>
@@ -940,12 +940,12 @@
           <w:tcPr>
             <w:tcW w:type="dxa" w:w="700"/>
             <w:tcBorders>
-              <w:top w:val="single" w:color="0D1B3E" w:sz="4"/>
-              <w:left w:val="single" w:color="0D1B3E" w:sz="4"/>
-              <w:bottom w:val="single" w:color="0D1B3E" w:sz="4"/>
-              <w:right w:val="single" w:color="0D1B3E" w:sz="4"/>
-            </w:tcBorders>
-            <w:shd w:fill="0D1B3E" w:val="clear"/>
+              <w:top w:val="single" w:color="1B4F72" w:sz="4"/>
+              <w:left w:val="single" w:color="1B4F72" w:sz="4"/>
+              <w:bottom w:val="single" w:color="1B4F72" w:sz="4"/>
+              <w:right w:val="single" w:color="1B4F72" w:sz="4"/>
+            </w:tcBorders>
+            <w:shd w:fill="1B4F72" w:val="clear"/>
             <w:tcMar>
               <w:top w:type="dxa" w:w="80"/>
               <w:left w:type="dxa" w:w="120"/>
@@ -971,12 +971,12 @@
           <w:tcPr>
             <w:tcW w:type="dxa" w:w="1600"/>
             <w:tcBorders>
-              <w:top w:val="single" w:color="0D1B3E" w:sz="4"/>
-              <w:left w:val="single" w:color="0D1B3E" w:sz="4"/>
-              <w:bottom w:val="single" w:color="0D1B3E" w:sz="4"/>
-              <w:right w:val="single" w:color="0D1B3E" w:sz="4"/>
-            </w:tcBorders>
-            <w:shd w:fill="0D1B3E" w:val="clear"/>
+              <w:top w:val="single" w:color="1B4F72" w:sz="4"/>
+              <w:left w:val="single" w:color="1B4F72" w:sz="4"/>
+              <w:bottom w:val="single" w:color="1B4F72" w:sz="4"/>
+              <w:right w:val="single" w:color="1B4F72" w:sz="4"/>
+            </w:tcBorders>
+            <w:shd w:fill="1B4F72" w:val="clear"/>
             <w:tcMar>
               <w:top w:type="dxa" w:w="80"/>
               <w:left w:type="dxa" w:w="120"/>
@@ -1002,12 +1002,12 @@
           <w:tcPr>
             <w:tcW w:type="dxa" w:w="926"/>
             <w:tcBorders>
-              <w:top w:val="single" w:color="0D1B3E" w:sz="4"/>
-              <w:left w:val="single" w:color="0D1B3E" w:sz="4"/>
-              <w:bottom w:val="single" w:color="0D1B3E" w:sz="4"/>
-              <w:right w:val="single" w:color="0D1B3E" w:sz="4"/>
-            </w:tcBorders>
-            <w:shd w:fill="0D1B3E" w:val="clear"/>
+              <w:top w:val="single" w:color="1B4F72" w:sz="4"/>
+              <w:left w:val="single" w:color="1B4F72" w:sz="4"/>
+              <w:bottom w:val="single" w:color="1B4F72" w:sz="4"/>
+              <w:right w:val="single" w:color="1B4F72" w:sz="4"/>
+            </w:tcBorders>
+            <w:shd w:fill="1B4F72" w:val="clear"/>
             <w:tcMar>
               <w:top w:type="dxa" w:w="80"/>
               <w:left w:type="dxa" w:w="120"/>
@@ -1035,10 +1035,10 @@
           <w:tcPr>
             <w:tcW w:type="dxa" w:w="4000"/>
             <w:tcBorders>
-              <w:top w:val="single" w:color="CCCCCC" w:sz="4"/>
-              <w:left w:val="single" w:color="CCCCCC" w:sz="4"/>
-              <w:bottom w:val="single" w:color="CCCCCC" w:sz="4"/>
-              <w:right w:val="single" w:color="CCCCCC" w:sz="4"/>
+              <w:top w:val="single" w:color="D5D8DC" w:sz="4"/>
+              <w:left w:val="single" w:color="D5D8DC" w:sz="4"/>
+              <w:bottom w:val="single" w:color="D5D8DC" w:sz="4"/>
+              <w:right w:val="single" w:color="D5D8DC" w:sz="4"/>
             </w:tcBorders>
             <w:shd w:fill="FFFFFF" w:val="clear"/>
             <w:tcMar>
@@ -1054,7 +1054,7 @@
                 <w:rFonts w:ascii="Arial" w:cs="Arial" w:eastAsia="Arial" w:hAnsi="Arial"/>
                 <w:b w:val="false"/>
                 <w:bCs w:val="false"/>
-                <w:color w:val="1A1A2E"/>
+                <w:color w:val="1C2833"/>
                 <w:sz w:val="18"/>
                 <w:szCs w:val="18"/>
               </w:rPr>
@@ -1066,10 +1066,10 @@
           <w:tcPr>
             <w:tcW w:type="dxa" w:w="1800"/>
             <w:tcBorders>
-              <w:top w:val="single" w:color="CCCCCC" w:sz="4"/>
-              <w:left w:val="single" w:color="CCCCCC" w:sz="4"/>
-              <w:bottom w:val="single" w:color="CCCCCC" w:sz="4"/>
-              <w:right w:val="single" w:color="CCCCCC" w:sz="4"/>
+              <w:top w:val="single" w:color="D5D8DC" w:sz="4"/>
+              <w:left w:val="single" w:color="D5D8DC" w:sz="4"/>
+              <w:bottom w:val="single" w:color="D5D8DC" w:sz="4"/>
+              <w:right w:val="single" w:color="D5D8DC" w:sz="4"/>
             </w:tcBorders>
             <w:shd w:fill="FFFFFF" w:val="clear"/>
             <w:tcMar>
@@ -1085,7 +1085,7 @@
                 <w:rFonts w:ascii="Arial" w:cs="Arial" w:eastAsia="Arial" w:hAnsi="Arial"/>
                 <w:b w:val="false"/>
                 <w:bCs w:val="false"/>
-                <w:color w:val="1A1A2E"/>
+                <w:color w:val="1C2833"/>
                 <w:sz w:val="18"/>
                 <w:szCs w:val="18"/>
               </w:rPr>
@@ -1097,10 +1097,10 @@
           <w:tcPr>
             <w:tcW w:type="dxa" w:w="700"/>
             <w:tcBorders>
-              <w:top w:val="single" w:color="CCCCCC" w:sz="4"/>
-              <w:left w:val="single" w:color="CCCCCC" w:sz="4"/>
-              <w:bottom w:val="single" w:color="CCCCCC" w:sz="4"/>
-              <w:right w:val="single" w:color="CCCCCC" w:sz="4"/>
+              <w:top w:val="single" w:color="D5D8DC" w:sz="4"/>
+              <w:left w:val="single" w:color="D5D8DC" w:sz="4"/>
+              <w:bottom w:val="single" w:color="D5D8DC" w:sz="4"/>
+              <w:right w:val="single" w:color="D5D8DC" w:sz="4"/>
             </w:tcBorders>
             <w:shd w:fill="FFFFFF" w:val="clear"/>
             <w:tcMar>
@@ -1116,7 +1116,7 @@
                 <w:rFonts w:ascii="Arial" w:cs="Arial" w:eastAsia="Arial" w:hAnsi="Arial"/>
                 <w:b w:val="false"/>
                 <w:bCs w:val="false"/>
-                <w:color w:val="1A1A2E"/>
+                <w:color w:val="1C2833"/>
                 <w:sz w:val="18"/>
                 <w:szCs w:val="18"/>
               </w:rPr>
@@ -1128,10 +1128,10 @@
           <w:tcPr>
             <w:tcW w:type="dxa" w:w="1600"/>
             <w:tcBorders>
-              <w:top w:val="single" w:color="CCCCCC" w:sz="4"/>
-              <w:left w:val="single" w:color="CCCCCC" w:sz="4"/>
-              <w:bottom w:val="single" w:color="CCCCCC" w:sz="4"/>
-              <w:right w:val="single" w:color="CCCCCC" w:sz="4"/>
+              <w:top w:val="single" w:color="D5D8DC" w:sz="4"/>
+              <w:left w:val="single" w:color="D5D8DC" w:sz="4"/>
+              <w:bottom w:val="single" w:color="D5D8DC" w:sz="4"/>
+              <w:right w:val="single" w:color="D5D8DC" w:sz="4"/>
             </w:tcBorders>
             <w:shd w:fill="FFFFFF" w:val="clear"/>
             <w:tcMar>
@@ -1147,7 +1147,7 @@
                 <w:rFonts w:ascii="Arial" w:cs="Arial" w:eastAsia="Arial" w:hAnsi="Arial"/>
                 <w:b w:val="false"/>
                 <w:bCs w:val="false"/>
-                <w:color w:val="1A1A2E"/>
+                <w:color w:val="1C2833"/>
                 <w:sz w:val="18"/>
                 <w:szCs w:val="18"/>
               </w:rPr>
@@ -1159,10 +1159,10 @@
           <w:tcPr>
             <w:tcW w:type="dxa" w:w="926"/>
             <w:tcBorders>
-              <w:top w:val="single" w:color="CCCCCC" w:sz="4"/>
-              <w:left w:val="single" w:color="CCCCCC" w:sz="4"/>
-              <w:bottom w:val="single" w:color="CCCCCC" w:sz="4"/>
-              <w:right w:val="single" w:color="CCCCCC" w:sz="4"/>
+              <w:top w:val="single" w:color="D5D8DC" w:sz="4"/>
+              <w:left w:val="single" w:color="D5D8DC" w:sz="4"/>
+              <w:bottom w:val="single" w:color="D5D8DC" w:sz="4"/>
+              <w:right w:val="single" w:color="D5D8DC" w:sz="4"/>
             </w:tcBorders>
             <w:shd w:fill="FFFFFF" w:val="clear"/>
             <w:tcMar>
@@ -1178,7 +1178,7 @@
                 <w:rFonts w:ascii="Arial" w:cs="Arial" w:eastAsia="Arial" w:hAnsi="Arial"/>
                 <w:b w:val="false"/>
                 <w:bCs w:val="false"/>
-                <w:color w:val="1A1A2E"/>
+                <w:color w:val="1C2833"/>
                 <w:sz w:val="18"/>
                 <w:szCs w:val="18"/>
               </w:rPr>
@@ -1198,7 +1198,7 @@
               <w:bottom w:val="none"/>
               <w:right w:val="none"/>
             </w:tcBorders>
-            <w:shd w:fill="1A3A6B" w:val="clear"/>
+            <w:shd w:fill="1B4F72" w:val="clear"/>
           </w:tcPr>
           <w:p/>
         </w:tc>
@@ -1211,7 +1211,7 @@
               <w:bottom w:val="none"/>
               <w:right w:val="none"/>
             </w:tcBorders>
-            <w:shd w:fill="1A3A6B" w:val="clear"/>
+            <w:shd w:fill="1B4F72" w:val="clear"/>
             <w:tcMar>
               <w:top w:type="dxa" w:w="90"/>
               <w:left w:type="dxa" w:w="100"/>
@@ -1245,7 +1245,7 @@
               <w:bottom w:val="none"/>
               <w:right w:val="none"/>
             </w:tcBorders>
-            <w:shd w:fill="1A3A6B" w:val="clear"/>
+            <w:shd w:fill="1B4F72" w:val="clear"/>
             <w:tcMar>
               <w:top w:type="dxa" w:w="90"/>
               <w:left w:type="dxa" w:w="100"/>
@@ -1262,7 +1262,7 @@
                 <w:rFonts w:ascii="Arial" w:cs="Arial" w:eastAsia="Arial" w:hAnsi="Arial"/>
                 <w:b/>
                 <w:bCs/>
-                <w:color w:val="C8A84B"/>
+                <w:color w:val="2E86C1"/>
                 <w:sz w:val="22"/>
                 <w:szCs w:val="22"/>
               </w:rPr>
@@ -1325,12 +1325,12 @@
                 <w:tcPr>
                   <w:tcW w:type="dxa" w:w="4874"/>
                   <w:tcBorders>
-                    <w:top w:val="single" w:color="0D1B3E" w:sz="4"/>
-                    <w:left w:val="single" w:color="0D1B3E" w:sz="4"/>
-                    <w:bottom w:val="single" w:color="0D1B3E" w:sz="4"/>
-                    <w:right w:val="single" w:color="0D1B3E" w:sz="4"/>
+                    <w:top w:val="single" w:color="1B4F72" w:sz="4"/>
+                    <w:left w:val="single" w:color="1B4F72" w:sz="4"/>
+                    <w:bottom w:val="single" w:color="1B4F72" w:sz="4"/>
+                    <w:right w:val="single" w:color="1B4F72" w:sz="4"/>
                   </w:tcBorders>
-                  <w:shd w:fill="0D1B3E" w:val="clear"/>
+                  <w:shd w:fill="1B4F72" w:val="clear"/>
                   <w:tcMar>
                     <w:top w:type="dxa" w:w="80"/>
                     <w:left w:type="dxa" w:w="120"/>
@@ -1358,12 +1358,12 @@
                 <w:tcPr>
                   <w:tcW w:type="dxa" w:w="4874"/>
                   <w:tcBorders>
-                    <w:top w:val="single" w:color="BBCFE0" w:sz="4"/>
-                    <w:left w:val="single" w:color="BBCFE0" w:sz="4"/>
-                    <w:bottom w:val="single" w:color="BBCFE0" w:sz="4"/>
-                    <w:right w:val="single" w:color="BBCFE0" w:sz="4"/>
+                    <w:top w:val="single" w:color="D5D8DC" w:sz="4"/>
+                    <w:left w:val="single" w:color="D5D8DC" w:sz="4"/>
+                    <w:bottom w:val="single" w:color="D5D8DC" w:sz="4"/>
+                    <w:right w:val="single" w:color="D5D8DC" w:sz="4"/>
                   </w:tcBorders>
-                  <w:shd w:fill="EBF5FB" w:val="clear"/>
+                  <w:shd w:fill="F4F6F7" w:val="clear"/>
                   <w:tcMar>
                     <w:top w:type="dxa" w:w="60"/>
                     <w:left w:type="dxa" w:w="100"/>
@@ -1377,7 +1377,7 @@
                       <w:rFonts w:ascii="Arial" w:cs="Arial" w:eastAsia="Arial" w:hAnsi="Arial"/>
                       <w:b w:val="false"/>
                       <w:bCs w:val="false"/>
-                      <w:color w:val="1A1A2E"/>
+                      <w:color w:val="1C2833"/>
                       <w:sz w:val="17"/>
                       <w:szCs w:val="17"/>
                     </w:rPr>
@@ -1391,12 +1391,12 @@
                 <w:tcPr>
                   <w:tcW w:type="dxa" w:w="4874"/>
                   <w:tcBorders>
-                    <w:top w:val="single" w:color="BBCFE0" w:sz="4"/>
-                    <w:left w:val="single" w:color="BBCFE0" w:sz="4"/>
-                    <w:bottom w:val="single" w:color="BBCFE0" w:sz="4"/>
-                    <w:right w:val="single" w:color="BBCFE0" w:sz="4"/>
+                    <w:top w:val="single" w:color="D5D8DC" w:sz="4"/>
+                    <w:left w:val="single" w:color="D5D8DC" w:sz="4"/>
+                    <w:bottom w:val="single" w:color="D5D8DC" w:sz="4"/>
+                    <w:right w:val="single" w:color="D5D8DC" w:sz="4"/>
                   </w:tcBorders>
-                  <w:shd w:fill="EBF5FB" w:val="clear"/>
+                  <w:shd w:fill="F4F6F7" w:val="clear"/>
                   <w:tcMar>
                     <w:top w:type="dxa" w:w="60"/>
                     <w:left w:type="dxa" w:w="100"/>
@@ -1410,7 +1410,7 @@
                       <w:rFonts w:ascii="Arial" w:cs="Arial" w:eastAsia="Arial" w:hAnsi="Arial"/>
                       <w:b w:val="false"/>
                       <w:bCs w:val="false"/>
-                      <w:color w:val="1A1A2E"/>
+                      <w:color w:val="1C2833"/>
                       <w:sz w:val="17"/>
                       <w:szCs w:val="17"/>
                     </w:rPr>
@@ -1424,12 +1424,12 @@
                 <w:tcPr>
                   <w:tcW w:type="dxa" w:w="4874"/>
                   <w:tcBorders>
-                    <w:top w:val="single" w:color="BBCFE0" w:sz="4"/>
-                    <w:left w:val="single" w:color="BBCFE0" w:sz="4"/>
-                    <w:bottom w:val="single" w:color="BBCFE0" w:sz="4"/>
-                    <w:right w:val="single" w:color="BBCFE0" w:sz="4"/>
+                    <w:top w:val="single" w:color="D5D8DC" w:sz="4"/>
+                    <w:left w:val="single" w:color="D5D8DC" w:sz="4"/>
+                    <w:bottom w:val="single" w:color="D5D8DC" w:sz="4"/>
+                    <w:right w:val="single" w:color="D5D8DC" w:sz="4"/>
                   </w:tcBorders>
-                  <w:shd w:fill="EBF5FB" w:val="clear"/>
+                  <w:shd w:fill="F4F6F7" w:val="clear"/>
                   <w:tcMar>
                     <w:top w:type="dxa" w:w="60"/>
                     <w:left w:type="dxa" w:w="100"/>
@@ -1443,7 +1443,7 @@
                       <w:rFonts w:ascii="Courier New" w:cs="Courier New" w:eastAsia="Courier New" w:hAnsi="Courier New"/>
                       <w:b w:val="false"/>
                       <w:bCs w:val="false"/>
-                      <w:color w:val="1A3A6B"/>
+                      <w:color w:val="1B4F72"/>
                       <w:sz w:val="16"/>
                       <w:szCs w:val="16"/>
                     </w:rPr>
@@ -1457,12 +1457,12 @@
                 <w:tcPr>
                   <w:tcW w:type="dxa" w:w="4874"/>
                   <w:tcBorders>
-                    <w:top w:val="single" w:color="BBCFE0" w:sz="4"/>
-                    <w:left w:val="single" w:color="BBCFE0" w:sz="4"/>
-                    <w:bottom w:val="single" w:color="BBCFE0" w:sz="4"/>
-                    <w:right w:val="single" w:color="BBCFE0" w:sz="4"/>
+                    <w:top w:val="single" w:color="D5D8DC" w:sz="4"/>
+                    <w:left w:val="single" w:color="D5D8DC" w:sz="4"/>
+                    <w:bottom w:val="single" w:color="D5D8DC" w:sz="4"/>
+                    <w:right w:val="single" w:color="D5D8DC" w:sz="4"/>
                   </w:tcBorders>
-                  <w:shd w:fill="EBF5FB" w:val="clear"/>
+                  <w:shd w:fill="F4F6F7" w:val="clear"/>
                   <w:tcMar>
                     <w:top w:type="dxa" w:w="60"/>
                     <w:left w:type="dxa" w:w="100"/>
@@ -1476,7 +1476,7 @@
                       <w:rFonts w:ascii="Courier New" w:cs="Courier New" w:eastAsia="Courier New" w:hAnsi="Courier New"/>
                       <w:b w:val="false"/>
                       <w:bCs w:val="false"/>
-                      <w:color w:val="1A3A6B"/>
+                      <w:color w:val="1B4F72"/>
                       <w:sz w:val="16"/>
                       <w:szCs w:val="16"/>
                     </w:rPr>
@@ -1490,12 +1490,12 @@
                 <w:tcPr>
                   <w:tcW w:type="dxa" w:w="4874"/>
                   <w:tcBorders>
-                    <w:top w:val="single" w:color="BBCFE0" w:sz="4"/>
-                    <w:left w:val="single" w:color="BBCFE0" w:sz="4"/>
-                    <w:bottom w:val="single" w:color="BBCFE0" w:sz="4"/>
-                    <w:right w:val="single" w:color="BBCFE0" w:sz="4"/>
+                    <w:top w:val="single" w:color="D5D8DC" w:sz="4"/>
+                    <w:left w:val="single" w:color="D5D8DC" w:sz="4"/>
+                    <w:bottom w:val="single" w:color="D5D8DC" w:sz="4"/>
+                    <w:right w:val="single" w:color="D5D8DC" w:sz="4"/>
                   </w:tcBorders>
-                  <w:shd w:fill="EBF5FB" w:val="clear"/>
+                  <w:shd w:fill="F4F6F7" w:val="clear"/>
                   <w:tcMar>
                     <w:top w:type="dxa" w:w="60"/>
                     <w:left w:type="dxa" w:w="100"/>
@@ -1509,7 +1509,7 @@
                       <w:rFonts w:ascii="Courier New" w:cs="Courier New" w:eastAsia="Courier New" w:hAnsi="Courier New"/>
                       <w:b w:val="false"/>
                       <w:bCs w:val="false"/>
-                      <w:color w:val="1A3A6B"/>
+                      <w:color w:val="1B4F72"/>
                       <w:sz w:val="16"/>
                       <w:szCs w:val="16"/>
                     </w:rPr>
@@ -1523,12 +1523,12 @@
                 <w:tcPr>
                   <w:tcW w:type="dxa" w:w="4874"/>
                   <w:tcBorders>
-                    <w:top w:val="single" w:color="BBCFE0" w:sz="4"/>
-                    <w:left w:val="single" w:color="BBCFE0" w:sz="4"/>
-                    <w:bottom w:val="single" w:color="BBCFE0" w:sz="4"/>
-                    <w:right w:val="single" w:color="BBCFE0" w:sz="4"/>
+                    <w:top w:val="single" w:color="D5D8DC" w:sz="4"/>
+                    <w:left w:val="single" w:color="D5D8DC" w:sz="4"/>
+                    <w:bottom w:val="single" w:color="D5D8DC" w:sz="4"/>
+                    <w:right w:val="single" w:color="D5D8DC" w:sz="4"/>
                   </w:tcBorders>
-                  <w:shd w:fill="EBF5FB" w:val="clear"/>
+                  <w:shd w:fill="F4F6F7" w:val="clear"/>
                   <w:tcMar>
                     <w:top w:type="dxa" w:w="60"/>
                     <w:left w:type="dxa" w:w="100"/>
@@ -1542,7 +1542,7 @@
                       <w:rFonts w:ascii="Arial" w:cs="Arial" w:eastAsia="Arial" w:hAnsi="Arial"/>
                       <w:b/>
                       <w:bCs/>
-                      <w:color w:val="1A1A2E"/>
+                      <w:color w:val="1C2833"/>
                       <w:sz w:val="17"/>
                       <w:szCs w:val="17"/>
                     </w:rPr>
@@ -1577,12 +1577,12 @@
                 <w:tcPr>
                   <w:tcW w:type="dxa" w:w="4874"/>
                   <w:tcBorders>
-                    <w:top w:val="single" w:color="1A3A6B" w:sz="4"/>
-                    <w:left w:val="single" w:color="1A3A6B" w:sz="4"/>
-                    <w:bottom w:val="single" w:color="1A3A6B" w:sz="4"/>
-                    <w:right w:val="single" w:color="1A3A6B" w:sz="4"/>
+                    <w:top w:val="single" w:color="1B4F72" w:sz="4"/>
+                    <w:left w:val="single" w:color="1B4F72" w:sz="4"/>
+                    <w:bottom w:val="single" w:color="1B4F72" w:sz="4"/>
+                    <w:right w:val="single" w:color="1B4F72" w:sz="4"/>
                   </w:tcBorders>
-                  <w:shd w:fill="1A3A6B" w:val="clear"/>
+                  <w:shd w:fill="1B4F72" w:val="clear"/>
                   <w:tcMar>
                     <w:top w:type="dxa" w:w="80"/>
                     <w:left w:type="dxa" w:w="120"/>
@@ -1610,12 +1610,12 @@
                 <w:tcPr>
                   <w:tcW w:type="dxa" w:w="4874"/>
                   <w:tcBorders>
-                    <w:top w:val="single" w:color="CCCCCC" w:sz="4"/>
-                    <w:left w:val="single" w:color="CCCCCC" w:sz="4"/>
-                    <w:bottom w:val="single" w:color="CCCCCC" w:sz="4"/>
-                    <w:right w:val="single" w:color="CCCCCC" w:sz="4"/>
+                    <w:top w:val="single" w:color="D5D8DC" w:sz="4"/>
+                    <w:left w:val="single" w:color="D5D8DC" w:sz="4"/>
+                    <w:bottom w:val="single" w:color="D5D8DC" w:sz="4"/>
+                    <w:right w:val="single" w:color="D5D8DC" w:sz="4"/>
                   </w:tcBorders>
-                  <w:shd w:fill="F5F7FA" w:val="clear"/>
+                  <w:shd w:fill="F4F6F7" w:val="clear"/>
                   <w:tcMar>
                     <w:top w:type="dxa" w:w="60"/>
                     <w:left w:type="dxa" w:w="100"/>
@@ -1627,7 +1627,7 @@
                   <w:r>
                     <w:rPr>
                       <w:rFonts w:ascii="Arial" w:cs="Arial" w:eastAsia="Arial" w:hAnsi="Arial"/>
-                      <w:color w:val="1A1A2E"/>
+                      <w:color w:val="1C2833"/>
                       <w:sz w:val="17"/>
                       <w:szCs w:val="17"/>
                     </w:rPr>
@@ -1641,10 +1641,10 @@
                 <w:tcPr>
                   <w:tcW w:type="dxa" w:w="4874"/>
                   <w:tcBorders>
-                    <w:top w:val="single" w:color="CCCCCC" w:sz="4"/>
-                    <w:left w:val="single" w:color="CCCCCC" w:sz="4"/>
-                    <w:bottom w:val="single" w:color="CCCCCC" w:sz="4"/>
-                    <w:right w:val="single" w:color="CCCCCC" w:sz="4"/>
+                    <w:top w:val="single" w:color="D5D8DC" w:sz="4"/>
+                    <w:left w:val="single" w:color="D5D8DC" w:sz="4"/>
+                    <w:bottom w:val="single" w:color="D5D8DC" w:sz="4"/>
+                    <w:right w:val="single" w:color="D5D8DC" w:sz="4"/>
                   </w:tcBorders>
                   <w:shd w:fill="FFFFFF" w:val="clear"/>
                   <w:tcMar>
@@ -1658,7 +1658,7 @@
                   <w:r>
                     <w:rPr>
                       <w:rFonts w:ascii="Arial" w:cs="Arial" w:eastAsia="Arial" w:hAnsi="Arial"/>
-                      <w:color w:val="1A1A2E"/>
+                      <w:color w:val="1C2833"/>
                       <w:sz w:val="17"/>
                       <w:szCs w:val="17"/>
                     </w:rPr>
@@ -1672,12 +1672,12 @@
                 <w:tcPr>
                   <w:tcW w:type="dxa" w:w="4874"/>
                   <w:tcBorders>
-                    <w:top w:val="single" w:color="CCCCCC" w:sz="4"/>
-                    <w:left w:val="single" w:color="CCCCCC" w:sz="4"/>
-                    <w:bottom w:val="single" w:color="CCCCCC" w:sz="4"/>
-                    <w:right w:val="single" w:color="CCCCCC" w:sz="4"/>
+                    <w:top w:val="single" w:color="D5D8DC" w:sz="4"/>
+                    <w:left w:val="single" w:color="D5D8DC" w:sz="4"/>
+                    <w:bottom w:val="single" w:color="D5D8DC" w:sz="4"/>
+                    <w:right w:val="single" w:color="D5D8DC" w:sz="4"/>
                   </w:tcBorders>
-                  <w:shd w:fill="F5F7FA" w:val="clear"/>
+                  <w:shd w:fill="F4F6F7" w:val="clear"/>
                   <w:tcMar>
                     <w:top w:type="dxa" w:w="60"/>
                     <w:left w:type="dxa" w:w="100"/>
@@ -1689,7 +1689,7 @@
                   <w:r>
                     <w:rPr>
                       <w:rFonts w:ascii="Arial" w:cs="Arial" w:eastAsia="Arial" w:hAnsi="Arial"/>
-                      <w:color w:val="1A1A2E"/>
+                      <w:color w:val="1C2833"/>
                       <w:sz w:val="17"/>
                       <w:szCs w:val="17"/>
                     </w:rPr>
@@ -1703,10 +1703,10 @@
                 <w:tcPr>
                   <w:tcW w:type="dxa" w:w="4874"/>
                   <w:tcBorders>
-                    <w:top w:val="single" w:color="CCCCCC" w:sz="4"/>
-                    <w:left w:val="single" w:color="CCCCCC" w:sz="4"/>
-                    <w:bottom w:val="single" w:color="CCCCCC" w:sz="4"/>
-                    <w:right w:val="single" w:color="CCCCCC" w:sz="4"/>
+                    <w:top w:val="single" w:color="D5D8DC" w:sz="4"/>
+                    <w:left w:val="single" w:color="D5D8DC" w:sz="4"/>
+                    <w:bottom w:val="single" w:color="D5D8DC" w:sz="4"/>
+                    <w:right w:val="single" w:color="D5D8DC" w:sz="4"/>
                   </w:tcBorders>
                   <w:shd w:fill="FFFFFF" w:val="clear"/>
                   <w:tcMar>
@@ -1720,7 +1720,7 @@
                   <w:r>
                     <w:rPr>
                       <w:rFonts w:ascii="Arial" w:cs="Arial" w:eastAsia="Arial" w:hAnsi="Arial"/>
-                      <w:color w:val="1A1A2E"/>
+                      <w:color w:val="1C2833"/>
                       <w:sz w:val="17"/>
                       <w:szCs w:val="17"/>
                     </w:rPr>
@@ -1774,12 +1774,12 @@
                 <w:tcPr>
                   <w:tcW w:type="dxa" w:w="3952"/>
                   <w:tcBorders>
-                    <w:top w:val="single" w:color="0D1B3E" w:sz="4"/>
-                    <w:left w:val="single" w:color="0D1B3E" w:sz="4"/>
-                    <w:bottom w:val="single" w:color="0D1B3E" w:sz="4"/>
-                    <w:right w:val="single" w:color="0D1B3E" w:sz="4"/>
+                    <w:top w:val="single" w:color="1B4F72" w:sz="4"/>
+                    <w:left w:val="single" w:color="1B4F72" w:sz="4"/>
+                    <w:bottom w:val="single" w:color="1B4F72" w:sz="4"/>
+                    <w:right w:val="single" w:color="1B4F72" w:sz="4"/>
                   </w:tcBorders>
-                  <w:shd w:fill="0D1B3E" w:val="clear"/>
+                  <w:shd w:fill="1B4F72" w:val="clear"/>
                   <w:tcMar>
                     <w:top w:type="dxa" w:w="80"/>
                     <w:left w:type="dxa" w:w="120"/>
@@ -1807,12 +1807,12 @@
                 <w:tcPr>
                   <w:tcW w:type="dxa" w:w="3952"/>
                   <w:tcBorders>
-                    <w:top w:val="single" w:color="CCCCCC" w:sz="4"/>
-                    <w:left w:val="single" w:color="CCCCCC" w:sz="4"/>
-                    <w:bottom w:val="single" w:color="CCCCCC" w:sz="4"/>
-                    <w:right w:val="single" w:color="CCCCCC" w:sz="4"/>
+                    <w:top w:val="single" w:color="D5D8DC" w:sz="4"/>
+                    <w:left w:val="single" w:color="D5D8DC" w:sz="4"/>
+                    <w:bottom w:val="single" w:color="D5D8DC" w:sz="4"/>
+                    <w:right w:val="single" w:color="D5D8DC" w:sz="4"/>
                   </w:tcBorders>
-                  <w:shd w:fill="F5F7FA" w:val="clear"/>
+                  <w:shd w:fill="F4F6F7" w:val="clear"/>
                   <w:tcMar>
                     <w:top w:type="dxa" w:w="80"/>
                     <w:left w:type="dxa" w:w="100"/>
@@ -1829,7 +1829,7 @@
                       <w:rFonts w:ascii="Arial" w:cs="Arial" w:eastAsia="Arial" w:hAnsi="Arial"/>
                       <w:i/>
                       <w:iCs/>
-                      <w:color w:val="888888"/>
+                      <w:color w:val="566573"/>
                       <w:sz w:val="16"/>
                       <w:szCs w:val="16"/>
                     </w:rPr>
@@ -1843,7 +1843,7 @@
                   <w:r>
                     <w:rPr>
                       <w:rFonts w:ascii="Arial" w:cs="Arial" w:eastAsia="Arial" w:hAnsi="Arial"/>
-                      <w:color w:val="888888"/>
+                      <w:color w:val="566573"/>
                       <w:sz w:val="16"/>
                       <w:szCs w:val="16"/>
                     </w:rPr>
@@ -1951,7 +1951,7 @@
                       <w:rFonts w:ascii="Arial" w:cs="Arial" w:eastAsia="Arial" w:hAnsi="Arial"/>
                       <w:b/>
                       <w:bCs/>
-                      <w:color w:val="0D1B3E"/>
+                      <w:color w:val="1B4F72"/>
                       <w:sz w:val="19"/>
                       <w:szCs w:val="19"/>
                     </w:rPr>
@@ -1965,7 +1965,7 @@
                   <w:r>
                     <w:rPr>
                       <w:rFonts w:ascii="Arial" w:cs="Arial" w:eastAsia="Arial" w:hAnsi="Arial"/>
-                      <w:color w:val="888888"/>
+                      <w:color w:val="566573"/>
                       <w:sz w:val="16"/>
                       <w:szCs w:val="16"/>
                     </w:rPr>
@@ -1979,7 +1979,7 @@
                   <w:r>
                     <w:rPr>
                       <w:rFonts w:ascii="Arial" w:cs="Arial" w:eastAsia="Arial" w:hAnsi="Arial"/>
-                      <w:color w:val="888888"/>
+                      <w:color w:val="566573"/>
                       <w:sz w:val="16"/>
                       <w:szCs w:val="16"/>
                     </w:rPr>
@@ -2050,7 +2050,7 @@
   <w:p>
     <w:pPr>
       <w:pBdr>
-        <w:top w:val="single" w:color="0D1B3E" w:sz="6" w:space="4"/>
+        <w:top w:val="single" w:color="1B4F72" w:sz="6" w:space="4"/>
       </w:pBdr>
       <w:spacing w:after="0" w:before="80"/>
       <w:jc w:val="center"/>
@@ -2058,7 +2058,7 @@
     <w:r>
       <w:rPr>
         <w:rFonts w:ascii="Arial" w:cs="Arial" w:eastAsia="Arial" w:hAnsi="Arial"/>
-        <w:color w:val="888888"/>
+        <w:color w:val="566573"/>
         <w:sz w:val="14"/>
         <w:szCs w:val="14"/>
       </w:rPr>
@@ -2206,7 +2206,7 @@
     <w:rPrDefault>
       <w:rPr>
         <w:rFonts w:ascii="Arial" w:cs="Arial" w:eastAsia="Arial" w:hAnsi="Arial"/>
-        <w:color w:val="1A1A2E"/>
+        <w:color w:val="1C2833"/>
         <w:sz w:val="18"/>
         <w:szCs w:val="18"/>
       </w:rPr>
@@ -2229,7 +2229,7 @@
     <w:next w:val="Normal"/>
     <w:qFormat/>
     <w:rPr>
-      <w:color w:val="2E74B5"/>
+      <w:color w:val="2E86C1"/>
       <w:sz w:val="32"/>
       <w:szCs w:val="32"/>
     </w:rPr>
@@ -2240,7 +2240,7 @@
     <w:next w:val="Normal"/>
     <w:qFormat/>
     <w:rPr>
-      <w:color w:val="2E74B5"/>
+      <w:color w:val="2E86C1"/>
       <w:sz w:val="26"/>
       <w:szCs w:val="26"/>
     </w:rPr>
@@ -2251,7 +2251,7 @@
     <w:next w:val="Normal"/>
     <w:qFormat/>
     <w:rPr>
-      <w:color w:val="1F4D78"/>
+      <w:color w:val="1B4F72"/>
       <w:sz w:val="24"/>
       <w:szCs w:val="24"/>
     </w:rPr>
@@ -2264,7 +2264,7 @@
     <w:rPr>
       <w:i/>
       <w:iCs/>
-      <w:color w:val="2E74B5"/>
+      <w:color w:val="2E86C1"/>
     </w:rPr>
   </w:style>
   <w:style w:type="paragraph" w:styleId="Heading5">
@@ -2273,7 +2273,7 @@
     <w:next w:val="Normal"/>
     <w:qFormat/>
     <w:rPr>
-      <w:color w:val="2E74B5"/>
+      <w:color w:val="2E86C1"/>
     </w:rPr>
   </w:style>
   <w:style w:type="paragraph" w:styleId="Heading6">
@@ -2282,7 +2282,7 @@
     <w:next w:val="Normal"/>
     <w:qFormat/>
     <w:rPr>
-      <w:color w:val="1F4D78"/>
+      <w:color w:val="1B4F72"/>
     </w:rPr>
   </w:style>
   <w:style w:type="paragraph" w:styleId="Strong">
@@ -2306,7 +2306,7 @@
     <w:uiPriority w:val="99"/>
     <w:unhideWhenUsed/>
     <w:rPr>
-      <w:color w:val="0563C1"/>
+      <w:color w:val="2E86C1"/>
       <w:u w:val="single"/>
     </w:rPr>
   </w:style>

</xml_diff>